<commit_message>
Adding 2 new models training
Adding 2 new training for Decision tree and Regressio dor BaselLine Datset
</commit_message>
<xml_diff>
--- a/Sander2022164_Thiago2022161_Report.docx
+++ b/Sander2022164_Thiago2022161_Report.docx
@@ -1016,7 +1016,44 @@
           <w:sz w:val="28"/>
           <w:szCs w:val="28"/>
         </w:rPr>
-        <w:t xml:space="preserve">CFS - </w:t>
+        <w:t xml:space="preserve">CFS </w:t>
+      </w:r>
+      <w:r>
+        <w:rPr>
+          <w:rFonts w:cs="Times New Roman"/>
+          <w:color w:val="EE0000"/>
+          <w:sz w:val="28"/>
+          <w:szCs w:val="28"/>
+        </w:rPr>
+        <w:t>–</w:t>
+      </w:r>
+      <w:r>
+        <w:rPr>
+          <w:rFonts w:cs="Times New Roman"/>
+          <w:color w:val="EE0000"/>
+          <w:sz w:val="28"/>
+          <w:szCs w:val="28"/>
+        </w:rPr>
+        <w:t xml:space="preserve"> </w:t>
+      </w:r>
+    </w:p>
+    <w:p>
+      <w:pPr>
+        <w:rPr>
+          <w:rFonts w:cs="Times New Roman"/>
+          <w:color w:val="EE0000"/>
+          <w:sz w:val="28"/>
+          <w:szCs w:val="28"/>
+        </w:rPr>
+      </w:pPr>
+      <w:r>
+        <w:rPr>
+          <w:rFonts w:cs="Times New Roman"/>
+          <w:color w:val="EE0000"/>
+          <w:sz w:val="28"/>
+          <w:szCs w:val="28"/>
+        </w:rPr>
+        <w:t xml:space="preserve">RF - </w:t>
       </w:r>
     </w:p>
     <w:p>
@@ -1090,7 +1127,6 @@
           <w:id w:val="-667025716"/>
           <w:citation/>
         </w:sdtPr>
-        <w:sdtEndPr/>
         <w:sdtContent>
           <w:r>
             <w:fldChar w:fldCharType="begin"/>
@@ -1171,7 +1207,6 @@
           <w:id w:val="-1831198940"/>
           <w:citation/>
         </w:sdtPr>
-        <w:sdtEndPr/>
         <w:sdtContent>
           <w:r>
             <w:fldChar w:fldCharType="begin"/>
@@ -1217,8 +1252,14 @@
           <w:ilvl w:val="1"/>
           <w:numId w:val="2"/>
         </w:numPr>
-      </w:pPr>
-      <w:r>
+        <w:rPr>
+          <w:color w:val="EE0000"/>
+        </w:rPr>
+      </w:pPr>
+      <w:r>
+        <w:rPr>
+          <w:color w:val="EE0000"/>
+        </w:rPr>
         <w:t>Project Concept</w:t>
       </w:r>
     </w:p>
@@ -1247,8 +1288,14 @@
           <w:ilvl w:val="1"/>
           <w:numId w:val="2"/>
         </w:numPr>
-      </w:pPr>
-      <w:r>
+        <w:rPr>
+          <w:color w:val="EE0000"/>
+        </w:rPr>
+      </w:pPr>
+      <w:r>
+        <w:rPr>
+          <w:color w:val="EE0000"/>
+        </w:rPr>
         <w:t>Project Aim</w:t>
       </w:r>
     </w:p>
@@ -1571,7 +1618,6 @@
           <w:id w:val="-113062448"/>
           <w:citation/>
         </w:sdtPr>
-        <w:sdtEndPr/>
         <w:sdtContent>
           <w:r>
             <w:fldChar w:fldCharType="begin"/>
@@ -1852,16 +1898,11 @@
       <w:r>
         <w:t xml:space="preserve">focused on comparing the </w:t>
       </w:r>
-      <w:proofErr w:type="gramStart"/>
       <w:r>
         <w:t>model</w:t>
       </w:r>
       <w:r>
-        <w:t>s</w:t>
-      </w:r>
-      <w:proofErr w:type="gramEnd"/>
-      <w:r>
-        <w:t xml:space="preserve"> </w:t>
+        <w:t xml:space="preserve">s </w:t>
       </w:r>
       <w:r>
         <w:t xml:space="preserve">using accuracy, precision, recall, macro F1-score, confusion matrix analysis, and cross-validation procedures. </w:t>
@@ -2019,21 +2060,12 @@
           <w:numId w:val="37"/>
         </w:numPr>
       </w:pPr>
-      <w:proofErr w:type="spellStart"/>
       <w:r>
         <w:rPr>
           <w:b/>
           <w:bCs/>
         </w:rPr>
-        <w:t>Jupyter</w:t>
-      </w:r>
-      <w:proofErr w:type="spellEnd"/>
-      <w:r>
-        <w:rPr>
-          <w:b/>
-          <w:bCs/>
-        </w:rPr>
-        <w:t xml:space="preserve"> Notebook:</w:t>
+        <w:t>Jupyter Notebook:</w:t>
       </w:r>
       <w:r>
         <w:t xml:space="preserve"> used for </w:t>
@@ -2125,13 +2157,8 @@
           <w:numId w:val="38"/>
         </w:numPr>
       </w:pPr>
-      <w:proofErr w:type="spellStart"/>
-      <w:r>
-        <w:t>Joblib</w:t>
-      </w:r>
-      <w:proofErr w:type="spellEnd"/>
-      <w:r>
-        <w:t xml:space="preserve"> for model saving and loading </w:t>
+      <w:r>
+        <w:t xml:space="preserve">Joblib for model saving and loading </w:t>
       </w:r>
     </w:p>
     <w:p>
@@ -2203,15 +2230,7 @@
     </w:p>
     <w:p>
       <w:r>
-        <w:t>So, this project focuses on using machine learning for intrusion detection to classify network traffic as benign or attack categories (</w:t>
-      </w:r>
-      <w:proofErr w:type="spellStart"/>
-      <w:r>
-        <w:t>Sharafaldin</w:t>
-      </w:r>
-      <w:proofErr w:type="spellEnd"/>
-      <w:r>
-        <w:t xml:space="preserve"> et al., 2018). It’s not intended to be a full enterprise security solution. It’s a lightweight decision-support prototype for IT administrators and MSP technicians.</w:t>
+        <w:t>So, this project focuses on using machine learning for intrusion detection to classify network traffic as benign or attack categories (Sharafaldin et al., 2018). It’s not intended to be a full enterprise security solution. It’s a lightweight decision-support prototype for IT administrators and MSP technicians.</w:t>
       </w:r>
     </w:p>
     <w:p>
@@ -2275,15 +2294,7 @@
     </w:p>
     <w:p>
       <w:r>
-        <w:t>From a machine learning perspective, the aim is to train and compare classification models with the CICIDS2017 dataset (</w:t>
-      </w:r>
-      <w:proofErr w:type="spellStart"/>
-      <w:r>
-        <w:t>Sharafaldin</w:t>
-      </w:r>
-      <w:proofErr w:type="spellEnd"/>
-      <w:r>
-        <w:t xml:space="preserve"> et al., 2018). The models need to be tested using appropriate metrics as accuracy is not a reliable result in an imbalanced IDS dataset </w:t>
+        <w:t xml:space="preserve">From a machine learning perspective, the aim is to train and compare classification models with the CICIDS2017 dataset (Sharafaldin et al., 2018). The models need to be tested using appropriate metrics as accuracy is not a reliable result in an imbalanced IDS dataset </w:t>
       </w:r>
       <w:r>
         <w:rPr>
@@ -2340,15 +2351,7 @@
     </w:p>
     <w:p>
       <w:r>
-        <w:t xml:space="preserve">Weaknesses: The model is trained on historical data, and it doesn’t update automatically. The dataset is simulated and may not fully reflect every real organization. Some attack types have very low support (Engelen et al., 2021; </w:t>
-      </w:r>
-      <w:proofErr w:type="spellStart"/>
-      <w:r>
-        <w:t>Sharafaldin</w:t>
-      </w:r>
-      <w:proofErr w:type="spellEnd"/>
-      <w:r>
-        <w:t>, et al., 2018).</w:t>
+        <w:t>Weaknesses: The model is trained on historical data, and it doesn’t update automatically. The dataset is simulated and may not fully reflect every real organization. Some attack types have very low support (Engelen et al., 2021; Sharafaldin, et al., 2018).</w:t>
       </w:r>
     </w:p>
     <w:p>
@@ -2405,15 +2408,7 @@
     </w:p>
     <w:p>
       <w:r>
-        <w:t xml:space="preserve">The key technologies used in this project are Python, Scikit-learn, </w:t>
-      </w:r>
-      <w:proofErr w:type="spellStart"/>
-      <w:r>
-        <w:t>Jupyter</w:t>
-      </w:r>
-      <w:proofErr w:type="spellEnd"/>
-      <w:r>
-        <w:t xml:space="preserve"> Notebook, and Streamlit.</w:t>
+        <w:t>The key technologies used in this project are Python, Scikit-learn, Jupyter Notebook, and Streamlit.</w:t>
       </w:r>
     </w:p>
     <w:p>
@@ -2423,15 +2418,7 @@
     </w:p>
     <w:p>
       <w:r>
-        <w:t xml:space="preserve">Code, output, graphs and explanations are all kept within </w:t>
-      </w:r>
-      <w:proofErr w:type="spellStart"/>
-      <w:r>
-        <w:t>Jupyter</w:t>
-      </w:r>
-      <w:proofErr w:type="spellEnd"/>
-      <w:r>
-        <w:t xml:space="preserve"> Notebook. Streamlit was chosen for the dashboard prototype as it can be used with Python to build a simple interface without complex web development (Streamlit, 2024).</w:t>
+        <w:t>Code, output, graphs and explanations are all kept within Jupyter Notebook. Streamlit was chosen for the dashboard prototype as it can be used with Python to build a simple interface without complex web development (Streamlit, 2024).</w:t>
       </w:r>
     </w:p>
     <w:p>
@@ -2539,31 +2526,7 @@
     </w:p>
     <w:p>
       <w:r>
-        <w:t xml:space="preserve">This dataset was chosen because it contains various types of attacks: DDoS, DoS, </w:t>
-      </w:r>
-      <w:proofErr w:type="spellStart"/>
-      <w:r>
-        <w:t>PortScan</w:t>
-      </w:r>
-      <w:proofErr w:type="spellEnd"/>
-      <w:r>
-        <w:t>, Bot, FTP-</w:t>
-      </w:r>
-      <w:proofErr w:type="spellStart"/>
-      <w:r>
-        <w:t>Patator</w:t>
-      </w:r>
-      <w:proofErr w:type="spellEnd"/>
-      <w:r>
-        <w:t>, SSH-</w:t>
-      </w:r>
-      <w:proofErr w:type="spellStart"/>
-      <w:r>
-        <w:t>Patator</w:t>
-      </w:r>
-      <w:proofErr w:type="spellEnd"/>
-      <w:r>
-        <w:t>, Web Attacks, Infiltration and Heartbleed. This makes it appropriate for a multiclass IDS project.</w:t>
+        <w:t>This dataset was chosen because it contains various types of attacks: DDoS, DoS, PortScan, Bot, FTP-Patator, SSH-Patator, Web Attacks, Infiltration and Heartbleed. This makes it appropriate for a multiclass IDS project.</w:t>
       </w:r>
     </w:p>
     <w:p>
@@ -2581,15 +2544,7 @@
     </w:p>
     <w:p>
       <w:r>
-        <w:t xml:space="preserve">The CICIDS2017 dataset is divided into several CSV files. Each file represents a different traffic period or attack scenario. For this project, eight CSV files were loaded using Python and Pandas, and merged into a single </w:t>
-      </w:r>
-      <w:proofErr w:type="spellStart"/>
-      <w:r>
-        <w:t>dataframe</w:t>
-      </w:r>
-      <w:proofErr w:type="spellEnd"/>
-      <w:r>
-        <w:t>.</w:t>
+        <w:t>The CICIDS2017 dataset is divided into several CSV files. Each file represents a different traffic period or attack scenario. For this project, eight CSV files were loaded using Python and Pandas, and merged into a single dataframe.</w:t>
       </w:r>
     </w:p>
     <w:p>
@@ -2657,21 +2612,31 @@
         <w:rPr>
           <w:szCs w:val="24"/>
         </w:rPr>
-        <w:t xml:space="preserve">The general structure of the source files was the same, with varying class distributions. For example, Monday had only benign traffic and other files had attacks like DDoS, </w:t>
-      </w:r>
-      <w:proofErr w:type="spellStart"/>
+        <w:t>The general structure of the source files was the same, with varying class distributions. For example, Monday had only benign traffic and other files had attacks like DDoS, PortScan, DoS, Bot and Web Attacks.</w:t>
+      </w:r>
+    </w:p>
+    <w:p>
       <w:r>
         <w:rPr>
           <w:szCs w:val="24"/>
         </w:rPr>
-        <w:t>PortScan</w:t>
-      </w:r>
-      <w:proofErr w:type="spellEnd"/>
+        <w:t xml:space="preserve">The first exploratory analysis revealed that the data is predominantly numerical. There were 79 columns, with 78 of them being numerical and only one (Label) being textual. This is convenient for machine learning, as Scikit-learn models are primarily designed to operate on numerical input data. </w:t>
+      </w:r>
+    </w:p>
+    <w:p>
       <w:r>
         <w:rPr>
           <w:szCs w:val="24"/>
         </w:rPr>
-        <w:t>, DoS, Bot and Web Attacks.</w:t>
+        <w:t>This dataset also required approximately 1.7GB of memory, indicating that efficient preprocessing and feature reduction would be crucial for the lightweight IDS goal.</w:t>
+      </w:r>
+    </w:p>
+    <w:p>
+      <w:pPr>
+        <w:pStyle w:val="Heading2"/>
+      </w:pPr>
+      <w:r>
+        <w:t>4.3 Target Variable and Class Distribution</w:t>
       </w:r>
     </w:p>
     <w:p>
@@ -2679,7 +2644,7 @@
         <w:rPr>
           <w:szCs w:val="24"/>
         </w:rPr>
-        <w:t xml:space="preserve">The first exploratory analysis revealed that the data is predominantly numerical. There were 79 columns, with 78 of them being numerical and only one (Label) being textual. This is convenient for machine learning, as Scikit-learn models are primarily designed to operate on numerical input data. </w:t>
+        <w:t>The result of the target analysis revealed that the dataset is extremely imbalanced. The majority class (BENIGN) has 2,273,097 records which corresponds to approximately 80.30% of the entire dataset.</w:t>
       </w:r>
     </w:p>
     <w:p>
@@ -2687,45 +2652,7 @@
         <w:rPr>
           <w:szCs w:val="24"/>
         </w:rPr>
-        <w:t>This dataset also required approximately 1.7GB of memory, indicating that efficient preprocessing and feature reduction would be crucial for the lightweight IDS goal.</w:t>
-      </w:r>
-    </w:p>
-    <w:p>
-      <w:pPr>
-        <w:pStyle w:val="Heading2"/>
-      </w:pPr>
-      <w:r>
-        <w:t>4.3 Target Variable and Class Distribution</w:t>
-      </w:r>
-    </w:p>
-    <w:p>
-      <w:r>
-        <w:rPr>
-          <w:szCs w:val="24"/>
-        </w:rPr>
-        <w:t>The result of the target analysis revealed that the dataset is extremely imbalanced. The majority class (BENIGN) has 2,273,097 records which corresponds to approximately 80.30% of the entire dataset.</w:t>
-      </w:r>
-    </w:p>
-    <w:p>
-      <w:r>
-        <w:rPr>
-          <w:szCs w:val="24"/>
-        </w:rPr>
-        <w:t xml:space="preserve">The most frequent attack classes were DoS Hulk, </w:t>
-      </w:r>
-      <w:proofErr w:type="spellStart"/>
-      <w:r>
-        <w:rPr>
-          <w:szCs w:val="24"/>
-        </w:rPr>
-        <w:t>PortScan</w:t>
-      </w:r>
-      <w:proofErr w:type="spellEnd"/>
-      <w:r>
-        <w:rPr>
-          <w:szCs w:val="24"/>
-        </w:rPr>
-        <w:t xml:space="preserve"> and DDoS. But there were some classes of attacks with very few records: Infiltration (36 records), Web Attack SQL Injection (21 records) and Heartbleed (11 records).</w:t>
+        <w:t>The most frequent attack classes were DoS Hulk, PortScan and DDoS. But there were some classes of attacks with very few records: Infiltration (36 records), Web Attack SQL Injection (21 records) and Heartbleed (11 records).</w:t>
       </w:r>
     </w:p>
     <w:p>
@@ -2838,21 +2765,7 @@
         <w:rPr>
           <w:szCs w:val="24"/>
         </w:rPr>
-        <w:t xml:space="preserve">Selected features like Flow Duration, Total </w:t>
-      </w:r>
-      <w:proofErr w:type="spellStart"/>
-      <w:r>
-        <w:rPr>
-          <w:szCs w:val="24"/>
-        </w:rPr>
-        <w:t>Fwd</w:t>
-      </w:r>
-      <w:proofErr w:type="spellEnd"/>
-      <w:r>
-        <w:rPr>
-          <w:szCs w:val="24"/>
-        </w:rPr>
-        <w:t xml:space="preserve"> Packets, Total Backward Packets and Flow Bytes/s were also displayed using boxplots. These plots confirmed the presence of extreme values and skewness in the distributions.</w:t>
+        <w:t>Selected features like Flow Duration, Total Fwd Packets, Total Backward Packets and Flow Bytes/s were also displayed using boxplots. These plots confirmed the presence of extreme values and skewness in the distributions.</w:t>
       </w:r>
     </w:p>
     <w:p>
@@ -3178,23 +3091,7 @@
         <w:tab/>
       </w:r>
       <w:r>
-        <w:t>Since most ML algorithm work only with numeric data, the “Label” column containing string values representing attack categories was encoded using Scikit-</w:t>
-      </w:r>
-      <w:proofErr w:type="spellStart"/>
-      <w:r>
-        <w:t>learn’s</w:t>
-      </w:r>
-      <w:proofErr w:type="spellEnd"/>
-      <w:r>
-        <w:t xml:space="preserve"> “</w:t>
-      </w:r>
-      <w:proofErr w:type="spellStart"/>
-      <w:r>
-        <w:t>LabelEncoder</w:t>
-      </w:r>
-      <w:proofErr w:type="spellEnd"/>
-      <w:r>
-        <w:t xml:space="preserve">”. </w:t>
+        <w:t xml:space="preserve">Since most ML algorithm work only with numeric data, the “Label” column containing string values representing attack categories was encoded using Scikit-learn’s “LabelEncoder”. </w:t>
       </w:r>
     </w:p>
     <w:p>
@@ -3218,7 +3115,6 @@
         <w:sdtPr>
           <w:id w:val="1142149005"/>
         </w:sdtPr>
-        <w:sdtEndPr/>
         <w:sdtContent>
           <w:r>
             <w:fldChar w:fldCharType="begin"/>
@@ -3583,13 +3479,8 @@
               <w:jc w:val="center"/>
             </w:pPr>
             <w:r>
-              <w:t xml:space="preserve">DoS </w:t>
+              <w:t>DoS GoldenEye</w:t>
             </w:r>
-            <w:proofErr w:type="spellStart"/>
-            <w:r>
-              <w:t>GoldenEye</w:t>
-            </w:r>
-            <w:proofErr w:type="spellEnd"/>
           </w:p>
         </w:tc>
         <w:tc>
@@ -3690,13 +3581,8 @@
               <w:jc w:val="center"/>
             </w:pPr>
             <w:r>
-              <w:t xml:space="preserve">DoS </w:t>
+              <w:t>DoS Slowhttptest</w:t>
             </w:r>
-            <w:proofErr w:type="spellStart"/>
-            <w:r>
-              <w:t>Slowhttptest</w:t>
-            </w:r>
-            <w:proofErr w:type="spellEnd"/>
           </w:p>
         </w:tc>
         <w:tc>
@@ -3746,13 +3632,8 @@
               <w:jc w:val="center"/>
             </w:pPr>
             <w:r>
-              <w:t xml:space="preserve">DoS </w:t>
+              <w:t>DoS slowloris</w:t>
             </w:r>
-            <w:proofErr w:type="spellStart"/>
-            <w:r>
-              <w:t>slowloris</w:t>
-            </w:r>
-            <w:proofErr w:type="spellEnd"/>
           </w:p>
         </w:tc>
         <w:tc>
@@ -3802,13 +3683,8 @@
               <w:jc w:val="center"/>
             </w:pPr>
             <w:r>
-              <w:t>FTP-</w:t>
+              <w:t>FTP-Patator</w:t>
             </w:r>
-            <w:proofErr w:type="spellStart"/>
-            <w:r>
-              <w:t>Patator</w:t>
-            </w:r>
-            <w:proofErr w:type="spellEnd"/>
           </w:p>
         </w:tc>
         <w:tc>
@@ -3857,11 +3733,9 @@
             <w:pPr>
               <w:jc w:val="center"/>
             </w:pPr>
-            <w:proofErr w:type="spellStart"/>
             <w:r>
               <w:t>Heatbleed</w:t>
             </w:r>
-            <w:proofErr w:type="spellEnd"/>
           </w:p>
         </w:tc>
         <w:tc>
@@ -3961,11 +3835,9 @@
             <w:pPr>
               <w:jc w:val="center"/>
             </w:pPr>
-            <w:proofErr w:type="spellStart"/>
             <w:r>
               <w:t>PortScan</w:t>
             </w:r>
-            <w:proofErr w:type="spellEnd"/>
           </w:p>
         </w:tc>
         <w:tc>
@@ -4015,13 +3887,8 @@
               <w:jc w:val="center"/>
             </w:pPr>
             <w:r>
-              <w:t>SSH-</w:t>
+              <w:t>SSH-Patator</w:t>
             </w:r>
-            <w:proofErr w:type="spellStart"/>
-            <w:r>
-              <w:t>Patator</w:t>
-            </w:r>
-            <w:proofErr w:type="spellEnd"/>
           </w:p>
         </w:tc>
         <w:tc>
@@ -4122,15 +3989,7 @@
               <w:jc w:val="center"/>
             </w:pPr>
             <w:r>
-              <w:t xml:space="preserve">Web Attack </w:t>
-            </w:r>
-            <w:proofErr w:type="spellStart"/>
-            <w:r>
-              <w:t>Sql</w:t>
-            </w:r>
-            <w:proofErr w:type="spellEnd"/>
-            <w:r>
-              <w:t xml:space="preserve"> Injection</w:t>
+              <w:t>Web Attack Sql Injection</w:t>
             </w:r>
           </w:p>
         </w:tc>
@@ -4287,7 +4146,6 @@
           <w:id w:val="1909498252"/>
           <w:citation/>
         </w:sdtPr>
-        <w:sdtEndPr/>
         <w:sdtContent>
           <w:r>
             <w:fldChar w:fldCharType="begin"/>
@@ -4317,7 +4175,6 @@
           <w:id w:val="-596181105"/>
           <w:citation/>
         </w:sdtPr>
-        <w:sdtEndPr/>
         <w:sdtContent>
           <w:r>
             <w:fldChar w:fldCharType="begin"/>
@@ -4483,7 +4340,6 @@
           <w:id w:val="-1947452564"/>
           <w:citation/>
         </w:sdtPr>
-        <w:sdtEndPr/>
         <w:sdtContent>
           <w:r>
             <w:fldChar w:fldCharType="begin"/>
@@ -4554,13 +4410,8 @@
         </w:numPr>
         <w:ind w:left="1710"/>
       </w:pPr>
-      <w:proofErr w:type="spellStart"/>
-      <w:r>
-        <w:t>X_train</w:t>
-      </w:r>
-      <w:proofErr w:type="spellEnd"/>
-      <w:r>
-        <w:t xml:space="preserve">: (2016638, 39) </w:t>
+      <w:r>
+        <w:t xml:space="preserve">X_train: (2016638, 39) </w:t>
       </w:r>
     </w:p>
     <w:p>
@@ -4572,13 +4423,8 @@
         </w:numPr>
         <w:ind w:left="1710"/>
       </w:pPr>
-      <w:proofErr w:type="spellStart"/>
-      <w:r>
-        <w:t>X_test</w:t>
-      </w:r>
-      <w:proofErr w:type="spellEnd"/>
-      <w:r>
-        <w:t xml:space="preserve">: (504160, 39) </w:t>
+      <w:r>
+        <w:t xml:space="preserve">X_test: (504160, 39) </w:t>
       </w:r>
     </w:p>
     <w:p>
@@ -4590,13 +4436,8 @@
         </w:numPr>
         <w:ind w:left="1710"/>
       </w:pPr>
-      <w:proofErr w:type="spellStart"/>
-      <w:r>
-        <w:t>y_train</w:t>
-      </w:r>
-      <w:proofErr w:type="spellEnd"/>
-      <w:r>
-        <w:t xml:space="preserve">: (2016638,) </w:t>
+      <w:r>
+        <w:t xml:space="preserve">y_train: (2016638,) </w:t>
       </w:r>
     </w:p>
     <w:p>
@@ -4608,13 +4449,8 @@
         </w:numPr>
         <w:ind w:left="1710"/>
       </w:pPr>
-      <w:proofErr w:type="spellStart"/>
-      <w:r>
-        <w:t>y_test</w:t>
-      </w:r>
-      <w:proofErr w:type="spellEnd"/>
-      <w:r>
-        <w:t>: (504160,)</w:t>
+      <w:r>
+        <w:t>y_test: (504160,)</w:t>
       </w:r>
     </w:p>
     <w:p>
@@ -4632,23 +4468,7 @@
         <w:tab/>
       </w:r>
       <w:r>
-        <w:t>We have also used a fixed “</w:t>
-      </w:r>
-      <w:proofErr w:type="spellStart"/>
-      <w:r>
-        <w:t>random_state</w:t>
-      </w:r>
-      <w:proofErr w:type="spellEnd"/>
-      <w:r>
-        <w:t>” value of 42 to ensure reproducibility of the experiments. Assigning a number to a “</w:t>
-      </w:r>
-      <w:proofErr w:type="spellStart"/>
-      <w:r>
-        <w:t>random_state</w:t>
-      </w:r>
-      <w:proofErr w:type="spellEnd"/>
-      <w:r>
-        <w:t xml:space="preserve">” assures that every time we run this same program/code it will provide the same results, even if used in different </w:t>
+        <w:t xml:space="preserve">We have also used a fixed “random_state” value of 42 to ensure reproducibility of the experiments. Assigning a number to a “random_state” assures that every time we run this same program/code it will provide the same results, even if used in different </w:t>
       </w:r>
       <w:r>
         <w:lastRenderedPageBreak/>
@@ -4658,7 +4478,6 @@
         <w:sdtPr>
           <w:id w:val="119428260"/>
         </w:sdtPr>
-        <w:sdtEndPr/>
         <w:sdtContent>
           <w:r>
             <w:fldChar w:fldCharType="begin"/>
@@ -4715,15 +4534,7 @@
         <w:tab/>
       </w:r>
       <w:r>
-        <w:t>In the dataset, many numerical features operated on significantly different scales, with some variables containing relatively small values, while other with extremely large magnitudes. To improve compatibility with ML algorithms, standardisation was applied using “</w:t>
-      </w:r>
-      <w:proofErr w:type="spellStart"/>
-      <w:r>
-        <w:t>StandardScaler</w:t>
-      </w:r>
-      <w:proofErr w:type="spellEnd"/>
-      <w:r>
-        <w:t>”.</w:t>
+        <w:t>In the dataset, many numerical features operated on significantly different scales, with some variables containing relatively small values, while other with extremely large magnitudes. To improve compatibility with ML algorithms, standardisation was applied using “StandardScaler”.</w:t>
       </w:r>
     </w:p>
     <w:p>
@@ -4754,7 +4565,6 @@
           <w:id w:val="854692267"/>
           <w:citation/>
         </w:sdtPr>
-        <w:sdtEndPr/>
         <w:sdtContent>
           <w:r>
             <w:fldChar w:fldCharType="begin"/>
@@ -4798,7 +4608,6 @@
         <w:sdtPr>
           <w:id w:val="657736855"/>
         </w:sdtPr>
-        <w:sdtEndPr/>
         <w:sdtContent>
           <w:r>
             <w:fldChar w:fldCharType="begin"/>
@@ -4824,7 +4633,6 @@
         <w:sdtPr>
           <w:id w:val="787391154"/>
         </w:sdtPr>
-        <w:sdtEndPr/>
         <w:sdtContent>
           <w:r>
             <w:fldChar w:fldCharType="begin"/>
@@ -4904,14 +4712,24 @@
       <w:r>
         <w:t xml:space="preserve">Table </w:t>
       </w:r>
-      <w:fldSimple w:instr=" SEQ Table \* ARABIC ">
-        <w:r>
-          <w:rPr>
-            <w:noProof/>
-          </w:rPr>
-          <w:t>2</w:t>
-        </w:r>
-      </w:fldSimple>
+      <w:r>
+        <w:fldChar w:fldCharType="begin"/>
+      </w:r>
+      <w:r>
+        <w:instrText xml:space="preserve"> SEQ Table \* ARABIC </w:instrText>
+      </w:r>
+      <w:r>
+        <w:fldChar w:fldCharType="separate"/>
+      </w:r>
+      <w:r>
+        <w:rPr>
+          <w:noProof/>
+        </w:rPr>
+        <w:t>2</w:t>
+      </w:r>
+      <w:r>
+        <w:fldChar w:fldCharType="end"/>
+      </w:r>
       <w:r>
         <w:t>: Classes with less than 1000 frequency</w:t>
       </w:r>
@@ -5036,15 +4854,7 @@
               <w:t>W</w:t>
             </w:r>
             <w:r>
-              <w:t xml:space="preserve">eb Attack </w:t>
-            </w:r>
-            <w:proofErr w:type="spellStart"/>
-            <w:r>
-              <w:t>Sql</w:t>
-            </w:r>
-            <w:proofErr w:type="spellEnd"/>
-            <w:r>
-              <w:t xml:space="preserve"> Injection</w:t>
+              <w:t>eb Attack Sql Injection</w:t>
             </w:r>
           </w:p>
         </w:tc>
@@ -5229,14 +5039,24 @@
       <w:r>
         <w:t xml:space="preserve">Table </w:t>
       </w:r>
-      <w:fldSimple w:instr=" SEQ Table \* ARABIC ">
-        <w:r>
-          <w:rPr>
-            <w:noProof/>
-          </w:rPr>
-          <w:t>3</w:t>
-        </w:r>
-      </w:fldSimple>
+      <w:r>
+        <w:fldChar w:fldCharType="begin"/>
+      </w:r>
+      <w:r>
+        <w:instrText xml:space="preserve"> SEQ Table \* ARABIC </w:instrText>
+      </w:r>
+      <w:r>
+        <w:fldChar w:fldCharType="separate"/>
+      </w:r>
+      <w:r>
+        <w:rPr>
+          <w:noProof/>
+        </w:rPr>
+        <w:t>3</w:t>
+      </w:r>
+      <w:r>
+        <w:fldChar w:fldCharType="end"/>
+      </w:r>
       <w:r>
         <w:t>: Controlled dataset's classes</w:t>
       </w:r>
@@ -5391,11 +5211,9 @@
             <w:pPr>
               <w:jc w:val="center"/>
             </w:pPr>
-            <w:proofErr w:type="spellStart"/>
             <w:r>
               <w:t>PortScan</w:t>
             </w:r>
-            <w:proofErr w:type="spellEnd"/>
           </w:p>
         </w:tc>
         <w:tc>
@@ -5425,13 +5243,8 @@
               <w:jc w:val="center"/>
             </w:pPr>
             <w:r>
-              <w:t xml:space="preserve">DoS </w:t>
+              <w:t>DoS GoldenEye</w:t>
             </w:r>
-            <w:proofErr w:type="spellStart"/>
-            <w:r>
-              <w:t>GoldenEye</w:t>
-            </w:r>
-            <w:proofErr w:type="spellEnd"/>
           </w:p>
         </w:tc>
         <w:tc>
@@ -5461,13 +5274,8 @@
               <w:jc w:val="center"/>
             </w:pPr>
             <w:r>
-              <w:t>FTP-</w:t>
+              <w:t>FTP-Patator</w:t>
             </w:r>
-            <w:proofErr w:type="spellStart"/>
-            <w:r>
-              <w:t>Patator</w:t>
-            </w:r>
-            <w:proofErr w:type="spellEnd"/>
           </w:p>
         </w:tc>
         <w:tc>
@@ -5497,13 +5305,8 @@
               <w:jc w:val="center"/>
             </w:pPr>
             <w:r>
-              <w:t xml:space="preserve">DoS </w:t>
+              <w:t>DoS slowloris</w:t>
             </w:r>
-            <w:proofErr w:type="spellStart"/>
-            <w:r>
-              <w:t>slowloris</w:t>
-            </w:r>
-            <w:proofErr w:type="spellEnd"/>
           </w:p>
         </w:tc>
         <w:tc>
@@ -5533,13 +5336,8 @@
               <w:jc w:val="center"/>
             </w:pPr>
             <w:r>
-              <w:t xml:space="preserve">DoS </w:t>
+              <w:t>DoS Slowhttptes</w:t>
             </w:r>
-            <w:proofErr w:type="spellStart"/>
-            <w:r>
-              <w:t>Slowhttptes</w:t>
-            </w:r>
-            <w:proofErr w:type="spellEnd"/>
           </w:p>
         </w:tc>
         <w:tc>
@@ -5569,13 +5367,8 @@
               <w:jc w:val="center"/>
             </w:pPr>
             <w:r>
-              <w:t>SSH-</w:t>
+              <w:t>SSH-Patator</w:t>
             </w:r>
-            <w:proofErr w:type="spellStart"/>
-            <w:r>
-              <w:t>Patator</w:t>
-            </w:r>
-            <w:proofErr w:type="spellEnd"/>
           </w:p>
         </w:tc>
         <w:tc>
@@ -5727,14 +5520,24 @@
       <w:r>
         <w:t xml:space="preserve">Table </w:t>
       </w:r>
-      <w:fldSimple w:instr=" SEQ Table \* ARABIC ">
-        <w:r>
-          <w:rPr>
-            <w:noProof/>
-          </w:rPr>
-          <w:t>4</w:t>
-        </w:r>
-      </w:fldSimple>
+      <w:r>
+        <w:fldChar w:fldCharType="begin"/>
+      </w:r>
+      <w:r>
+        <w:instrText xml:space="preserve"> SEQ Table \* ARABIC </w:instrText>
+      </w:r>
+      <w:r>
+        <w:fldChar w:fldCharType="separate"/>
+      </w:r>
+      <w:r>
+        <w:rPr>
+          <w:noProof/>
+        </w:rPr>
+        <w:t>4</w:t>
+      </w:r>
+      <w:r>
+        <w:fldChar w:fldCharType="end"/>
+      </w:r>
       <w:r>
         <w:t>: Label encoded for Controlled Dataset</w:t>
       </w:r>
@@ -5952,11 +5755,9 @@
             <w:pPr>
               <w:jc w:val="center"/>
             </w:pPr>
-            <w:proofErr w:type="spellStart"/>
             <w:r>
               <w:t>PortScan</w:t>
             </w:r>
-            <w:proofErr w:type="spellEnd"/>
           </w:p>
         </w:tc>
         <w:tc>
@@ -5999,13 +5800,8 @@
               <w:jc w:val="center"/>
             </w:pPr>
             <w:r>
-              <w:t xml:space="preserve">DoS </w:t>
+              <w:t>DoS GoldenEye</w:t>
             </w:r>
-            <w:proofErr w:type="spellStart"/>
-            <w:r>
-              <w:t>GoldenEye</w:t>
-            </w:r>
-            <w:proofErr w:type="spellEnd"/>
           </w:p>
         </w:tc>
         <w:tc>
@@ -6048,13 +5844,8 @@
               <w:jc w:val="center"/>
             </w:pPr>
             <w:r>
-              <w:t>FTP-</w:t>
+              <w:t>FTP-Patator</w:t>
             </w:r>
-            <w:proofErr w:type="spellStart"/>
-            <w:r>
-              <w:t>Patator</w:t>
-            </w:r>
-            <w:proofErr w:type="spellEnd"/>
           </w:p>
         </w:tc>
         <w:tc>
@@ -6097,13 +5888,8 @@
               <w:jc w:val="center"/>
             </w:pPr>
             <w:r>
-              <w:t xml:space="preserve">DoS </w:t>
+              <w:t>DoS slowloris</w:t>
             </w:r>
-            <w:proofErr w:type="spellStart"/>
-            <w:r>
-              <w:t>slowloris</w:t>
-            </w:r>
-            <w:proofErr w:type="spellEnd"/>
           </w:p>
         </w:tc>
         <w:tc>
@@ -6146,13 +5932,8 @@
               <w:jc w:val="center"/>
             </w:pPr>
             <w:r>
-              <w:t xml:space="preserve">DoS </w:t>
+              <w:t>DoS Slowhttptes</w:t>
             </w:r>
-            <w:proofErr w:type="spellStart"/>
-            <w:r>
-              <w:t>Slowhttptes</w:t>
-            </w:r>
-            <w:proofErr w:type="spellEnd"/>
           </w:p>
         </w:tc>
         <w:tc>
@@ -6195,13 +5976,8 @@
               <w:jc w:val="center"/>
             </w:pPr>
             <w:r>
-              <w:t>SSH-</w:t>
+              <w:t>SSH-Patator</w:t>
             </w:r>
-            <w:proofErr w:type="spellStart"/>
-            <w:r>
-              <w:t>Patator</w:t>
-            </w:r>
-            <w:proofErr w:type="spellEnd"/>
           </w:p>
         </w:tc>
         <w:tc>
@@ -6394,13 +6170,8 @@
         </w:numPr>
         <w:ind w:left="1710"/>
       </w:pPr>
-      <w:proofErr w:type="spellStart"/>
-      <w:r>
-        <w:t>X_train_ctrl</w:t>
-      </w:r>
-      <w:proofErr w:type="spellEnd"/>
-      <w:r>
-        <w:t xml:space="preserve"> shape: (2016062, 39)</w:t>
+      <w:r>
+        <w:t>X_train_ctrl shape: (2016062, 39)</w:t>
       </w:r>
     </w:p>
     <w:p>
@@ -6412,14 +6183,9 @@
         </w:numPr>
         <w:ind w:left="1710"/>
       </w:pPr>
-      <w:proofErr w:type="spellStart"/>
       <w:r>
         <w:lastRenderedPageBreak/>
-        <w:t>X_test_ctrl</w:t>
-      </w:r>
-      <w:proofErr w:type="spellEnd"/>
-      <w:r>
-        <w:t xml:space="preserve"> shape: (504016, 39)</w:t>
+        <w:t>X_test_ctrl shape: (504016, 39)</w:t>
       </w:r>
     </w:p>
     <w:p>
@@ -6431,13 +6197,8 @@
         </w:numPr>
         <w:ind w:left="1710"/>
       </w:pPr>
-      <w:proofErr w:type="spellStart"/>
-      <w:r>
-        <w:t>y_train_ctrl</w:t>
-      </w:r>
-      <w:proofErr w:type="spellEnd"/>
-      <w:r>
-        <w:t xml:space="preserve"> shape: (2016062,)</w:t>
+      <w:r>
+        <w:t>y_train_ctrl shape: (2016062,)</w:t>
       </w:r>
     </w:p>
     <w:p>
@@ -6449,13 +6210,8 @@
         </w:numPr>
         <w:ind w:left="1710"/>
       </w:pPr>
-      <w:proofErr w:type="spellStart"/>
-      <w:r>
-        <w:t>y_test_ctrl</w:t>
-      </w:r>
-      <w:proofErr w:type="spellEnd"/>
-      <w:r>
-        <w:t xml:space="preserve"> shape: (504016,)</w:t>
+      <w:r>
+        <w:t>y_test_ctrl shape: (504016,)</w:t>
       </w:r>
     </w:p>
     <w:p>
@@ -6492,7 +6248,6 @@
           <w:id w:val="-1967189922"/>
           <w:citation/>
         </w:sdtPr>
-        <w:sdtEndPr/>
         <w:sdtContent>
           <w:r>
             <w:fldChar w:fldCharType="begin"/>
@@ -6577,7 +6332,6 @@
         <w:t>)</w:t>
       </w:r>
     </w:p>
-    <w:p/>
     <w:p>
       <w:pPr>
         <w:tabs>
@@ -6596,7 +6350,13 @@
         <w:t xml:space="preserve">This phase focuses on training </w:t>
       </w:r>
       <w:r>
-        <w:t xml:space="preserve">different ML models using the prepared CICIDS2017 dataset. </w:t>
+        <w:t xml:space="preserve">different ML models </w:t>
+      </w:r>
+      <w:r>
+        <w:t xml:space="preserve">(Random Forest, Logistic Regression, and Decision Tree) </w:t>
+      </w:r>
+      <w:r>
+        <w:t xml:space="preserve">using the prepared CICIDS2017 dataset. </w:t>
       </w:r>
       <w:r>
         <w:t>Its main objective is not only to achieve strong classification performance, but also to analyse how preprocessing decisions and balancing approaches affect the reliability, efficiency, and practicality</w:t>
@@ -6620,13 +6380,7 @@
         <w:tab/>
       </w:r>
       <w:r>
-        <w:t>To ensure consistency during experimentation; all machine learning models follow a similar workflow</w:t>
-      </w:r>
-      <w:r>
-        <w:t xml:space="preserve"> of dataset usage</w:t>
-      </w:r>
-      <w:r>
-        <w:t>:</w:t>
+        <w:t>To ensure consistency during experimentation, all machine learning models follow a similar workflow:</w:t>
       </w:r>
     </w:p>
     <w:p>
@@ -6701,9 +6455,418 @@
         <w:t>.</w:t>
       </w:r>
     </w:p>
-    <w:p/>
-    <w:p/>
-    <w:p/>
+    <w:p>
+      <w:pPr>
+        <w:pStyle w:val="Heading2"/>
+        <w:numPr>
+          <w:ilvl w:val="1"/>
+          <w:numId w:val="2"/>
+        </w:numPr>
+      </w:pPr>
+      <w:r>
+        <w:t>Random Forest</w:t>
+      </w:r>
+    </w:p>
+    <w:p>
+      <w:pPr>
+        <w:tabs>
+          <w:tab w:val="left" w:pos="720"/>
+        </w:tabs>
+        <w:ind w:left="630"/>
+        <w:jc w:val="both"/>
+      </w:pPr>
+      <w:r>
+        <w:tab/>
+      </w:r>
+      <w:r>
+        <w:tab/>
+      </w:r>
+      <w:r>
+        <w:t>Random Forest is an ensemble machine learning algorithm based on multiple Decision Trees</w:t>
+      </w:r>
+      <w:r>
+        <w:t xml:space="preserve"> (n_estimators)</w:t>
+      </w:r>
+      <w:r>
+        <w:t>. Instead of using a single tree for classification, the algorithm generates several trees using different bootstrap samples taken from the original dataset. Each tree independently analyses the input data and produces its own classification result. During prediction, the final class is selected based on the majority vote across all trees in the forest. This approach helps improve model stability, reduce overfitting, and increase classification reliability compared to using a single Decision Tree model</w:t>
+      </w:r>
+      <w:r>
+        <w:t xml:space="preserve"> </w:t>
+      </w:r>
+      <w:sdt>
+        <w:sdtPr>
+          <w:id w:val="999927034"/>
+          <w:citation/>
+        </w:sdtPr>
+        <w:sdtContent>
+          <w:r>
+            <w:fldChar w:fldCharType="begin"/>
+          </w:r>
+          <w:r>
+            <w:rPr>
+              <w:lang w:val="en-US"/>
+            </w:rPr>
+            <w:instrText xml:space="preserve"> CITATION MdA13 \l 1033 </w:instrText>
+          </w:r>
+          <w:r>
+            <w:fldChar w:fldCharType="separate"/>
+          </w:r>
+          <w:r>
+            <w:rPr>
+              <w:noProof/>
+              <w:lang w:val="en-US"/>
+            </w:rPr>
+            <w:t>(Hasan, et al., 2013)</w:t>
+          </w:r>
+          <w:r>
+            <w:fldChar w:fldCharType="end"/>
+          </w:r>
+        </w:sdtContent>
+      </w:sdt>
+      <w:r>
+        <w:t>.</w:t>
+      </w:r>
+    </w:p>
+    <w:p>
+      <w:pPr>
+        <w:pStyle w:val="Heading3"/>
+        <w:numPr>
+          <w:ilvl w:val="2"/>
+          <w:numId w:val="2"/>
+        </w:numPr>
+        <w:rPr>
+          <w:rFonts w:ascii="Times New Roman" w:hAnsi="Times New Roman" w:cs="Times New Roman"/>
+          <w:b/>
+          <w:bCs/>
+          <w:sz w:val="26"/>
+          <w:szCs w:val="26"/>
+        </w:rPr>
+      </w:pPr>
+      <w:r>
+        <w:rPr>
+          <w:rFonts w:ascii="Times New Roman" w:hAnsi="Times New Roman" w:cs="Times New Roman"/>
+          <w:b/>
+          <w:bCs/>
+          <w:sz w:val="26"/>
+          <w:szCs w:val="26"/>
+        </w:rPr>
+        <w:t>Random Forest – Baseline Model</w:t>
+      </w:r>
+    </w:p>
+    <w:p>
+      <w:pPr>
+        <w:ind w:left="1440" w:firstLine="720"/>
+      </w:pPr>
+      <w:r>
+        <w:t>The Baseline Random Forest configuration used was:</w:t>
+      </w:r>
+    </w:p>
+    <w:p>
+      <w:pPr>
+        <w:pStyle w:val="ListParagraph"/>
+        <w:numPr>
+          <w:ilvl w:val="0"/>
+          <w:numId w:val="45"/>
+        </w:numPr>
+        <w:ind w:left="2340" w:hanging="180"/>
+      </w:pPr>
+      <w:r>
+        <w:t>n_estimators</w:t>
+      </w:r>
+      <w:r>
+        <w:t xml:space="preserve"> = 100</w:t>
+      </w:r>
+      <w:r>
+        <w:t xml:space="preserve"> – Can range from 100-500, however as we are trying to </w:t>
+      </w:r>
+      <w:r>
+        <w:t>reduce computational cost and training time, 100 can provide a good balance between strong predictions</w:t>
+      </w:r>
+      <w:r>
+        <w:t xml:space="preserve">, reduced overfitting and computational cost </w:t>
+      </w:r>
+      <w:sdt>
+        <w:sdtPr>
+          <w:id w:val="-1104955639"/>
+          <w:citation/>
+        </w:sdtPr>
+        <w:sdtContent>
+          <w:r>
+            <w:fldChar w:fldCharType="begin"/>
+          </w:r>
+          <w:r>
+            <w:rPr>
+              <w:lang w:val="en-US"/>
+            </w:rPr>
+            <w:instrText xml:space="preserve"> CITATION SAN24 \l 1033 </w:instrText>
+          </w:r>
+          <w:r>
+            <w:fldChar w:fldCharType="separate"/>
+          </w:r>
+          <w:r>
+            <w:rPr>
+              <w:noProof/>
+              <w:lang w:val="en-US"/>
+            </w:rPr>
+            <w:t>(SANDHU, et al., 2024)</w:t>
+          </w:r>
+          <w:r>
+            <w:fldChar w:fldCharType="end"/>
+          </w:r>
+        </w:sdtContent>
+      </w:sdt>
+      <w:r>
+        <w:t>.</w:t>
+      </w:r>
+    </w:p>
+    <w:p>
+      <w:pPr>
+        <w:pStyle w:val="ListParagraph"/>
+        <w:numPr>
+          <w:ilvl w:val="0"/>
+          <w:numId w:val="45"/>
+        </w:numPr>
+        <w:ind w:left="2340" w:hanging="180"/>
+      </w:pPr>
+      <w:r>
+        <w:t>random_state = 42</w:t>
+      </w:r>
+      <w:r>
+        <w:t xml:space="preserve"> – Explained above where </w:t>
+      </w:r>
+      <w:r>
+        <w:t>it</w:t>
+      </w:r>
+      <w:r>
+        <w:t xml:space="preserve"> </w:t>
+      </w:r>
+      <w:r>
+        <w:t>works</w:t>
+      </w:r>
+      <w:r>
+        <w:t xml:space="preserve"> as a placeholder to save the outcome of </w:t>
+      </w:r>
+      <w:r>
+        <w:t>randomness,</w:t>
+      </w:r>
+      <w:r>
+        <w:t xml:space="preserve"> so we don’t get random </w:t>
+      </w:r>
+      <w:r>
+        <w:t>results anytime running the program.</w:t>
+      </w:r>
+    </w:p>
+    <w:p>
+      <w:pPr>
+        <w:pStyle w:val="ListParagraph"/>
+        <w:numPr>
+          <w:ilvl w:val="0"/>
+          <w:numId w:val="45"/>
+        </w:numPr>
+        <w:ind w:left="2340" w:hanging="180"/>
+      </w:pPr>
+      <w:r>
+        <w:t>n_jobs = -1.</w:t>
+      </w:r>
+      <w:r>
+        <w:t xml:space="preserve"> – Using all available CPUs.</w:t>
+      </w:r>
+    </w:p>
+    <w:p>
+      <w:pPr>
+        <w:ind w:left="1440" w:firstLine="720"/>
+      </w:pPr>
+      <w:r>
+        <w:lastRenderedPageBreak/>
+        <w:t>The model was trained using the scaled training dataset and predictions were generated using the testing dataset.</w:t>
+      </w:r>
+    </w:p>
+    <w:p>
+      <w:pPr>
+        <w:pStyle w:val="Heading3"/>
+        <w:numPr>
+          <w:ilvl w:val="2"/>
+          <w:numId w:val="2"/>
+        </w:numPr>
+        <w:rPr>
+          <w:rFonts w:ascii="Times New Roman" w:hAnsi="Times New Roman" w:cs="Times New Roman"/>
+          <w:b/>
+          <w:bCs/>
+          <w:sz w:val="26"/>
+          <w:szCs w:val="26"/>
+        </w:rPr>
+      </w:pPr>
+      <w:r>
+        <w:rPr>
+          <w:rFonts w:ascii="Times New Roman" w:hAnsi="Times New Roman" w:cs="Times New Roman"/>
+          <w:b/>
+          <w:bCs/>
+          <w:sz w:val="26"/>
+          <w:szCs w:val="26"/>
+        </w:rPr>
+        <w:t xml:space="preserve">Random Forest </w:t>
+      </w:r>
+      <w:r>
+        <w:rPr>
+          <w:rFonts w:ascii="Times New Roman" w:hAnsi="Times New Roman" w:cs="Times New Roman"/>
+          <w:b/>
+          <w:bCs/>
+          <w:sz w:val="26"/>
+          <w:szCs w:val="26"/>
+        </w:rPr>
+        <w:t>–</w:t>
+      </w:r>
+      <w:r>
+        <w:rPr>
+          <w:rFonts w:ascii="Times New Roman" w:hAnsi="Times New Roman" w:cs="Times New Roman"/>
+          <w:b/>
+          <w:bCs/>
+          <w:sz w:val="26"/>
+          <w:szCs w:val="26"/>
+        </w:rPr>
+        <w:t xml:space="preserve"> </w:t>
+      </w:r>
+      <w:r>
+        <w:rPr>
+          <w:rFonts w:ascii="Times New Roman" w:hAnsi="Times New Roman" w:cs="Times New Roman"/>
+          <w:b/>
+          <w:bCs/>
+          <w:sz w:val="26"/>
+          <w:szCs w:val="26"/>
+        </w:rPr>
+        <w:t>Class Weighting</w:t>
+      </w:r>
+    </w:p>
+    <w:p>
+      <w:pPr>
+        <w:ind w:left="1440" w:firstLine="720"/>
+      </w:pPr>
+      <w:r>
+        <w:t xml:space="preserve">Since </w:t>
+      </w:r>
+      <w:r>
+        <w:t xml:space="preserve">our dataset is very class imbalanced, class weighting was </w:t>
+      </w:r>
+      <w:r>
+        <w:t xml:space="preserve">applied. </w:t>
+      </w:r>
+      <w:r>
+        <w:t xml:space="preserve">While standard random forests may struggle with minority class prediction, </w:t>
+      </w:r>
+      <w:r>
+        <w:t xml:space="preserve">Balanced Random Forest </w:t>
+      </w:r>
+      <w:r>
+        <w:t>improves accuracy by equally</w:t>
+      </w:r>
+      <w:r>
+        <w:t xml:space="preserve"> sampling from both </w:t>
+      </w:r>
+      <w:r>
+        <w:t>minority and</w:t>
+      </w:r>
+      <w:r>
+        <w:t xml:space="preserve"> majority classes during tree construction</w:t>
+      </w:r>
+      <w:r>
+        <w:t xml:space="preserve"> </w:t>
+      </w:r>
+      <w:sdt>
+        <w:sdtPr>
+          <w:id w:val="-2080740079"/>
+          <w:citation/>
+        </w:sdtPr>
+        <w:sdtContent>
+          <w:r>
+            <w:fldChar w:fldCharType="begin"/>
+          </w:r>
+          <w:r>
+            <w:instrText xml:space="preserve"> CITATION Tah24 \l 1033 </w:instrText>
+          </w:r>
+          <w:r>
+            <w:fldChar w:fldCharType="separate"/>
+          </w:r>
+          <w:r>
+            <w:t>(Fulazzaky, et al., 2024)</w:t>
+          </w:r>
+          <w:r>
+            <w:fldChar w:fldCharType="end"/>
+          </w:r>
+        </w:sdtContent>
+      </w:sdt>
+      <w:r>
+        <w:t>.</w:t>
+      </w:r>
+    </w:p>
+    <w:p>
+      <w:pPr>
+        <w:ind w:left="1440" w:firstLine="720"/>
+      </w:pPr>
+      <w:r>
+        <w:t>Therefore, it was added the following parameter:</w:t>
+      </w:r>
+    </w:p>
+    <w:p>
+      <w:pPr>
+        <w:pStyle w:val="ListParagraph"/>
+        <w:numPr>
+          <w:ilvl w:val="0"/>
+          <w:numId w:val="45"/>
+        </w:numPr>
+        <w:ind w:left="2340" w:hanging="180"/>
+      </w:pPr>
+      <w:r>
+        <w:t>class_weight = ‘balanced’.</w:t>
+      </w:r>
+    </w:p>
+    <w:p>
+      <w:pPr>
+        <w:pStyle w:val="Heading3"/>
+        <w:numPr>
+          <w:ilvl w:val="2"/>
+          <w:numId w:val="2"/>
+        </w:numPr>
+        <w:rPr>
+          <w:rFonts w:ascii="Times New Roman" w:hAnsi="Times New Roman" w:cs="Times New Roman"/>
+          <w:b/>
+          <w:bCs/>
+          <w:sz w:val="26"/>
+          <w:szCs w:val="26"/>
+        </w:rPr>
+      </w:pPr>
+      <w:r>
+        <w:rPr>
+          <w:rFonts w:ascii="Times New Roman" w:hAnsi="Times New Roman" w:cs="Times New Roman"/>
+          <w:b/>
+          <w:bCs/>
+          <w:sz w:val="26"/>
+          <w:szCs w:val="26"/>
+        </w:rPr>
+        <w:t>Random Forest – Controlled Dataset</w:t>
+      </w:r>
+    </w:p>
+    <w:p>
+      <w:pPr>
+        <w:ind w:left="1440" w:firstLine="720"/>
+      </w:pPr>
+      <w:r>
+        <w:t>After the initial Random Forest experiments, the model was also trained using the controlled multiclass dataset created during the Data Preparation phase.</w:t>
+      </w:r>
+      <w:r>
+        <w:t xml:space="preserve"> </w:t>
+      </w:r>
+      <w:r>
+        <w:t>These classes were removed to improve modelling stability and reduce the impact of extremely rare categories during training.</w:t>
+      </w:r>
+    </w:p>
+    <w:p>
+      <w:pPr>
+        <w:ind w:left="1440" w:firstLine="720"/>
+      </w:pPr>
+      <w:r>
+        <w:t>The controlled RF configuration used was same as the Class weighting, only changing the dataset.</w:t>
+      </w:r>
+    </w:p>
     <w:p>
       <w:pPr>
         <w:pStyle w:val="Heading1"/>
@@ -6811,7 +6974,6 @@
           <w:bCs/>
           <w:color w:val="auto"/>
         </w:rPr>
-        <w:lastRenderedPageBreak/>
         <w:t>Conclusion</w:t>
       </w:r>
     </w:p>
@@ -9069,6 +9231,119 @@
     </w:lvl>
   </w:abstractNum>
   <w:abstractNum w:abstractNumId="16" w15:restartNumberingAfterBreak="0">
+    <w:nsid w:val="27187375"/>
+    <w:multiLevelType w:val="hybridMultilevel"/>
+    <w:tmpl w:val="60A87AF0"/>
+    <w:lvl w:ilvl="0" w:tplc="18090001">
+      <w:start w:val="1"/>
+      <w:numFmt w:val="bullet"/>
+      <w:lvlText w:val=""/>
+      <w:lvlJc w:val="left"/>
+      <w:pPr>
+        <w:ind w:left="1440" w:hanging="360"/>
+      </w:pPr>
+      <w:rPr>
+        <w:rFonts w:ascii="Symbol" w:hAnsi="Symbol" w:hint="default"/>
+      </w:rPr>
+    </w:lvl>
+    <w:lvl w:ilvl="1" w:tplc="18090003" w:tentative="1">
+      <w:start w:val="1"/>
+      <w:numFmt w:val="bullet"/>
+      <w:lvlText w:val="o"/>
+      <w:lvlJc w:val="left"/>
+      <w:pPr>
+        <w:ind w:left="2160" w:hanging="360"/>
+      </w:pPr>
+      <w:rPr>
+        <w:rFonts w:ascii="Courier New" w:hAnsi="Courier New" w:cs="Courier New" w:hint="default"/>
+      </w:rPr>
+    </w:lvl>
+    <w:lvl w:ilvl="2" w:tplc="18090005" w:tentative="1">
+      <w:start w:val="1"/>
+      <w:numFmt w:val="bullet"/>
+      <w:lvlText w:val=""/>
+      <w:lvlJc w:val="left"/>
+      <w:pPr>
+        <w:ind w:left="2880" w:hanging="360"/>
+      </w:pPr>
+      <w:rPr>
+        <w:rFonts w:ascii="Wingdings" w:hAnsi="Wingdings" w:hint="default"/>
+      </w:rPr>
+    </w:lvl>
+    <w:lvl w:ilvl="3" w:tplc="18090001" w:tentative="1">
+      <w:start w:val="1"/>
+      <w:numFmt w:val="bullet"/>
+      <w:lvlText w:val=""/>
+      <w:lvlJc w:val="left"/>
+      <w:pPr>
+        <w:ind w:left="3600" w:hanging="360"/>
+      </w:pPr>
+      <w:rPr>
+        <w:rFonts w:ascii="Symbol" w:hAnsi="Symbol" w:hint="default"/>
+      </w:rPr>
+    </w:lvl>
+    <w:lvl w:ilvl="4" w:tplc="18090003" w:tentative="1">
+      <w:start w:val="1"/>
+      <w:numFmt w:val="bullet"/>
+      <w:lvlText w:val="o"/>
+      <w:lvlJc w:val="left"/>
+      <w:pPr>
+        <w:ind w:left="4320" w:hanging="360"/>
+      </w:pPr>
+      <w:rPr>
+        <w:rFonts w:ascii="Courier New" w:hAnsi="Courier New" w:cs="Courier New" w:hint="default"/>
+      </w:rPr>
+    </w:lvl>
+    <w:lvl w:ilvl="5" w:tplc="18090005" w:tentative="1">
+      <w:start w:val="1"/>
+      <w:numFmt w:val="bullet"/>
+      <w:lvlText w:val=""/>
+      <w:lvlJc w:val="left"/>
+      <w:pPr>
+        <w:ind w:left="5040" w:hanging="360"/>
+      </w:pPr>
+      <w:rPr>
+        <w:rFonts w:ascii="Wingdings" w:hAnsi="Wingdings" w:hint="default"/>
+      </w:rPr>
+    </w:lvl>
+    <w:lvl w:ilvl="6" w:tplc="18090001" w:tentative="1">
+      <w:start w:val="1"/>
+      <w:numFmt w:val="bullet"/>
+      <w:lvlText w:val=""/>
+      <w:lvlJc w:val="left"/>
+      <w:pPr>
+        <w:ind w:left="5760" w:hanging="360"/>
+      </w:pPr>
+      <w:rPr>
+        <w:rFonts w:ascii="Symbol" w:hAnsi="Symbol" w:hint="default"/>
+      </w:rPr>
+    </w:lvl>
+    <w:lvl w:ilvl="7" w:tplc="18090003" w:tentative="1">
+      <w:start w:val="1"/>
+      <w:numFmt w:val="bullet"/>
+      <w:lvlText w:val="o"/>
+      <w:lvlJc w:val="left"/>
+      <w:pPr>
+        <w:ind w:left="6480" w:hanging="360"/>
+      </w:pPr>
+      <w:rPr>
+        <w:rFonts w:ascii="Courier New" w:hAnsi="Courier New" w:cs="Courier New" w:hint="default"/>
+      </w:rPr>
+    </w:lvl>
+    <w:lvl w:ilvl="8" w:tplc="18090005" w:tentative="1">
+      <w:start w:val="1"/>
+      <w:numFmt w:val="bullet"/>
+      <w:lvlText w:val=""/>
+      <w:lvlJc w:val="left"/>
+      <w:pPr>
+        <w:ind w:left="7200" w:hanging="360"/>
+      </w:pPr>
+      <w:rPr>
+        <w:rFonts w:ascii="Wingdings" w:hAnsi="Wingdings" w:hint="default"/>
+      </w:rPr>
+    </w:lvl>
+  </w:abstractNum>
+  <w:abstractNum w:abstractNumId="17" w15:restartNumberingAfterBreak="0">
     <w:nsid w:val="308C197B"/>
     <w:multiLevelType w:val="multilevel"/>
     <w:tmpl w:val="49802A58"/>
@@ -9211,7 +9486,7 @@
       </w:rPr>
     </w:lvl>
   </w:abstractNum>
-  <w:abstractNum w:abstractNumId="17" w15:restartNumberingAfterBreak="0">
+  <w:abstractNum w:abstractNumId="18" w15:restartNumberingAfterBreak="0">
     <w:nsid w:val="31E13455"/>
     <w:multiLevelType w:val="hybridMultilevel"/>
     <w:tmpl w:val="FF7E3DC4"/>
@@ -9326,7 +9601,7 @@
       </w:rPr>
     </w:lvl>
   </w:abstractNum>
-  <w:abstractNum w:abstractNumId="18" w15:restartNumberingAfterBreak="0">
+  <w:abstractNum w:abstractNumId="19" w15:restartNumberingAfterBreak="0">
     <w:nsid w:val="323960BF"/>
     <w:multiLevelType w:val="hybridMultilevel"/>
     <w:tmpl w:val="AC329CCE"/>
@@ -9439,7 +9714,7 @@
       </w:rPr>
     </w:lvl>
   </w:abstractNum>
-  <w:abstractNum w:abstractNumId="19" w15:restartNumberingAfterBreak="0">
+  <w:abstractNum w:abstractNumId="20" w15:restartNumberingAfterBreak="0">
     <w:nsid w:val="33CD0DA1"/>
     <w:multiLevelType w:val="hybridMultilevel"/>
     <w:tmpl w:val="F880FE90"/>
@@ -9525,7 +9800,7 @@
       </w:pPr>
     </w:lvl>
   </w:abstractNum>
-  <w:abstractNum w:abstractNumId="20" w15:restartNumberingAfterBreak="0">
+  <w:abstractNum w:abstractNumId="21" w15:restartNumberingAfterBreak="0">
     <w:nsid w:val="37DB00A2"/>
     <w:multiLevelType w:val="hybridMultilevel"/>
     <w:tmpl w:val="DCC4CA34"/>
@@ -9611,7 +9886,7 @@
       </w:pPr>
     </w:lvl>
   </w:abstractNum>
-  <w:abstractNum w:abstractNumId="21" w15:restartNumberingAfterBreak="0">
+  <w:abstractNum w:abstractNumId="22" w15:restartNumberingAfterBreak="0">
     <w:nsid w:val="3DBA3FFA"/>
     <w:multiLevelType w:val="multilevel"/>
     <w:tmpl w:val="192E8008"/>
@@ -9760,7 +10035,7 @@
       </w:rPr>
     </w:lvl>
   </w:abstractNum>
-  <w:abstractNum w:abstractNumId="22" w15:restartNumberingAfterBreak="0">
+  <w:abstractNum w:abstractNumId="23" w15:restartNumberingAfterBreak="0">
     <w:nsid w:val="3F461D86"/>
     <w:multiLevelType w:val="hybridMultilevel"/>
     <w:tmpl w:val="B5D4F79E"/>
@@ -9873,7 +10148,7 @@
       </w:rPr>
     </w:lvl>
   </w:abstractNum>
-  <w:abstractNum w:abstractNumId="23" w15:restartNumberingAfterBreak="0">
+  <w:abstractNum w:abstractNumId="24" w15:restartNumberingAfterBreak="0">
     <w:nsid w:val="446D5ED4"/>
     <w:multiLevelType w:val="multilevel"/>
     <w:tmpl w:val="DFFC6046"/>
@@ -10020,7 +10295,7 @@
       </w:rPr>
     </w:lvl>
   </w:abstractNum>
-  <w:abstractNum w:abstractNumId="24" w15:restartNumberingAfterBreak="0">
+  <w:abstractNum w:abstractNumId="25" w15:restartNumberingAfterBreak="0">
     <w:nsid w:val="474A1FDC"/>
     <w:multiLevelType w:val="hybridMultilevel"/>
     <w:tmpl w:val="DAF6967A"/>
@@ -10106,7 +10381,7 @@
       </w:pPr>
     </w:lvl>
   </w:abstractNum>
-  <w:abstractNum w:abstractNumId="25" w15:restartNumberingAfterBreak="0">
+  <w:abstractNum w:abstractNumId="26" w15:restartNumberingAfterBreak="0">
     <w:nsid w:val="48D2558A"/>
     <w:multiLevelType w:val="hybridMultilevel"/>
     <w:tmpl w:val="90E89720"/>
@@ -10219,7 +10494,7 @@
       </w:rPr>
     </w:lvl>
   </w:abstractNum>
-  <w:abstractNum w:abstractNumId="26" w15:restartNumberingAfterBreak="0">
+  <w:abstractNum w:abstractNumId="27" w15:restartNumberingAfterBreak="0">
     <w:nsid w:val="4A02684C"/>
     <w:multiLevelType w:val="multilevel"/>
     <w:tmpl w:val="CC4E6B80"/>
@@ -10368,7 +10643,7 @@
       </w:rPr>
     </w:lvl>
   </w:abstractNum>
-  <w:abstractNum w:abstractNumId="27" w15:restartNumberingAfterBreak="0">
+  <w:abstractNum w:abstractNumId="28" w15:restartNumberingAfterBreak="0">
     <w:nsid w:val="4D033872"/>
     <w:multiLevelType w:val="hybridMultilevel"/>
     <w:tmpl w:val="71DEF4A0"/>
@@ -10454,7 +10729,7 @@
       </w:pPr>
     </w:lvl>
   </w:abstractNum>
-  <w:abstractNum w:abstractNumId="28" w15:restartNumberingAfterBreak="0">
+  <w:abstractNum w:abstractNumId="29" w15:restartNumberingAfterBreak="0">
     <w:nsid w:val="4FE8322E"/>
     <w:multiLevelType w:val="multilevel"/>
     <w:tmpl w:val="BB005E46"/>
@@ -10603,7 +10878,7 @@
       </w:rPr>
     </w:lvl>
   </w:abstractNum>
-  <w:abstractNum w:abstractNumId="29" w15:restartNumberingAfterBreak="0">
+  <w:abstractNum w:abstractNumId="30" w15:restartNumberingAfterBreak="0">
     <w:nsid w:val="50366BAB"/>
     <w:multiLevelType w:val="hybridMultilevel"/>
     <w:tmpl w:val="8F4E38A8"/>
@@ -10716,7 +10991,7 @@
       </w:rPr>
     </w:lvl>
   </w:abstractNum>
-  <w:abstractNum w:abstractNumId="30" w15:restartNumberingAfterBreak="0">
+  <w:abstractNum w:abstractNumId="31" w15:restartNumberingAfterBreak="0">
     <w:nsid w:val="5091002F"/>
     <w:multiLevelType w:val="multilevel"/>
     <w:tmpl w:val="657A5616"/>
@@ -10865,7 +11140,7 @@
       </w:rPr>
     </w:lvl>
   </w:abstractNum>
-  <w:abstractNum w:abstractNumId="31" w15:restartNumberingAfterBreak="0">
+  <w:abstractNum w:abstractNumId="32" w15:restartNumberingAfterBreak="0">
     <w:nsid w:val="54381E7E"/>
     <w:multiLevelType w:val="multilevel"/>
     <w:tmpl w:val="E9142DB4"/>
@@ -11014,7 +11289,7 @@
       </w:rPr>
     </w:lvl>
   </w:abstractNum>
-  <w:abstractNum w:abstractNumId="32" w15:restartNumberingAfterBreak="0">
+  <w:abstractNum w:abstractNumId="33" w15:restartNumberingAfterBreak="0">
     <w:nsid w:val="5EB51096"/>
     <w:multiLevelType w:val="multilevel"/>
     <w:tmpl w:val="DFDA58FA"/>
@@ -11163,7 +11438,7 @@
       </w:rPr>
     </w:lvl>
   </w:abstractNum>
-  <w:abstractNum w:abstractNumId="33" w15:restartNumberingAfterBreak="0">
+  <w:abstractNum w:abstractNumId="34" w15:restartNumberingAfterBreak="0">
     <w:nsid w:val="5F701260"/>
     <w:multiLevelType w:val="hybridMultilevel"/>
     <w:tmpl w:val="25069ED8"/>
@@ -11276,7 +11551,7 @@
       </w:rPr>
     </w:lvl>
   </w:abstractNum>
-  <w:abstractNum w:abstractNumId="34" w15:restartNumberingAfterBreak="0">
+  <w:abstractNum w:abstractNumId="35" w15:restartNumberingAfterBreak="0">
     <w:nsid w:val="5FB26F03"/>
     <w:multiLevelType w:val="hybridMultilevel"/>
     <w:tmpl w:val="4F4452CA"/>
@@ -11389,7 +11664,7 @@
       </w:rPr>
     </w:lvl>
   </w:abstractNum>
-  <w:abstractNum w:abstractNumId="35" w15:restartNumberingAfterBreak="0">
+  <w:abstractNum w:abstractNumId="36" w15:restartNumberingAfterBreak="0">
     <w:nsid w:val="6E9E7839"/>
     <w:multiLevelType w:val="multilevel"/>
     <w:tmpl w:val="4F7A86EC"/>
@@ -11532,7 +11807,7 @@
       </w:rPr>
     </w:lvl>
   </w:abstractNum>
-  <w:abstractNum w:abstractNumId="36" w15:restartNumberingAfterBreak="0">
+  <w:abstractNum w:abstractNumId="37" w15:restartNumberingAfterBreak="0">
     <w:nsid w:val="71D07D1E"/>
     <w:multiLevelType w:val="hybridMultilevel"/>
     <w:tmpl w:val="6B9472DA"/>
@@ -11645,7 +11920,7 @@
       </w:rPr>
     </w:lvl>
   </w:abstractNum>
-  <w:abstractNum w:abstractNumId="37" w15:restartNumberingAfterBreak="0">
+  <w:abstractNum w:abstractNumId="38" w15:restartNumberingAfterBreak="0">
     <w:nsid w:val="71D12832"/>
     <w:multiLevelType w:val="hybridMultilevel"/>
     <w:tmpl w:val="4DC605EE"/>
@@ -11735,7 +12010,7 @@
       </w:pPr>
     </w:lvl>
   </w:abstractNum>
-  <w:abstractNum w:abstractNumId="38" w15:restartNumberingAfterBreak="0">
+  <w:abstractNum w:abstractNumId="39" w15:restartNumberingAfterBreak="0">
     <w:nsid w:val="730E2CE4"/>
     <w:multiLevelType w:val="hybridMultilevel"/>
     <w:tmpl w:val="B19C2364"/>
@@ -11848,7 +12123,7 @@
       </w:rPr>
     </w:lvl>
   </w:abstractNum>
-  <w:abstractNum w:abstractNumId="39" w15:restartNumberingAfterBreak="0">
+  <w:abstractNum w:abstractNumId="40" w15:restartNumberingAfterBreak="0">
     <w:nsid w:val="735250AE"/>
     <w:multiLevelType w:val="hybridMultilevel"/>
     <w:tmpl w:val="0486C16C"/>
@@ -11938,7 +12213,7 @@
       </w:pPr>
     </w:lvl>
   </w:abstractNum>
-  <w:abstractNum w:abstractNumId="40" w15:restartNumberingAfterBreak="0">
+  <w:abstractNum w:abstractNumId="41" w15:restartNumberingAfterBreak="0">
     <w:nsid w:val="768807E1"/>
     <w:multiLevelType w:val="multilevel"/>
     <w:tmpl w:val="DF78BF4E"/>
@@ -12087,7 +12362,7 @@
       </w:rPr>
     </w:lvl>
   </w:abstractNum>
-  <w:abstractNum w:abstractNumId="41" w15:restartNumberingAfterBreak="0">
+  <w:abstractNum w:abstractNumId="42" w15:restartNumberingAfterBreak="0">
     <w:nsid w:val="77567B85"/>
     <w:multiLevelType w:val="multilevel"/>
     <w:tmpl w:val="0270F6FC"/>
@@ -12236,10 +12511,10 @@
       </w:rPr>
     </w:lvl>
   </w:abstractNum>
-  <w:abstractNum w:abstractNumId="42" w15:restartNumberingAfterBreak="0">
+  <w:abstractNum w:abstractNumId="43" w15:restartNumberingAfterBreak="0">
     <w:nsid w:val="7A014B14"/>
     <w:multiLevelType w:val="multilevel"/>
-    <w:tmpl w:val="49802A58"/>
+    <w:tmpl w:val="F71697B6"/>
     <w:lvl w:ilvl="0">
       <w:start w:val="1"/>
       <w:numFmt w:val="decimal"/>
@@ -12283,19 +12558,36 @@
         <w:ind w:left="2520" w:hanging="720"/>
       </w:pPr>
       <w:rPr>
+        <w:rFonts w:ascii="Times New Roman" w:hAnsi="Times New Roman" w:cs="Times New Roman" w:hint="default"/>
+        <w:b/>
+        <w:bCs/>
+        <w:color w:val="auto"/>
+        <w:sz w:val="26"/>
+      </w:rPr>
+    </w:lvl>
+    <w:lvl w:ilvl="3">
+      <w:start w:val="1"/>
+      <w:numFmt w:val="decimal"/>
+      <w:isLgl/>
+      <w:lvlText w:val="%1.%2.%3.%4"/>
+      <w:lvlJc w:val="left"/>
+      <w:pPr>
+        <w:ind w:left="3240" w:hanging="720"/>
+      </w:pPr>
+      <w:rPr>
         <w:rFonts w:hint="default"/>
         <w:color w:val="B3186D" w:themeColor="accent1" w:themeShade="BF"/>
         <w:sz w:val="26"/>
       </w:rPr>
     </w:lvl>
-    <w:lvl w:ilvl="3">
+    <w:lvl w:ilvl="4">
       <w:start w:val="1"/>
       <w:numFmt w:val="decimal"/>
       <w:isLgl/>
-      <w:lvlText w:val="%1.%2.%3.%4"/>
-      <w:lvlJc w:val="left"/>
-      <w:pPr>
-        <w:ind w:left="3240" w:hanging="720"/>
+      <w:lvlText w:val="%1.%2.%3.%4.%5"/>
+      <w:lvlJc w:val="left"/>
+      <w:pPr>
+        <w:ind w:left="4320" w:hanging="1080"/>
       </w:pPr>
       <w:rPr>
         <w:rFonts w:hint="default"/>
@@ -12303,14 +12595,14 @@
         <w:sz w:val="26"/>
       </w:rPr>
     </w:lvl>
-    <w:lvl w:ilvl="4">
+    <w:lvl w:ilvl="5">
       <w:start w:val="1"/>
       <w:numFmt w:val="decimal"/>
       <w:isLgl/>
-      <w:lvlText w:val="%1.%2.%3.%4.%5"/>
-      <w:lvlJc w:val="left"/>
-      <w:pPr>
-        <w:ind w:left="4320" w:hanging="1080"/>
+      <w:lvlText w:val="%1.%2.%3.%4.%5.%6"/>
+      <w:lvlJc w:val="left"/>
+      <w:pPr>
+        <w:ind w:left="5040" w:hanging="1080"/>
       </w:pPr>
       <w:rPr>
         <w:rFonts w:hint="default"/>
@@ -12318,14 +12610,14 @@
         <w:sz w:val="26"/>
       </w:rPr>
     </w:lvl>
-    <w:lvl w:ilvl="5">
+    <w:lvl w:ilvl="6">
       <w:start w:val="1"/>
       <w:numFmt w:val="decimal"/>
       <w:isLgl/>
-      <w:lvlText w:val="%1.%2.%3.%4.%5.%6"/>
-      <w:lvlJc w:val="left"/>
-      <w:pPr>
-        <w:ind w:left="5040" w:hanging="1080"/>
+      <w:lvlText w:val="%1.%2.%3.%4.%5.%6.%7"/>
+      <w:lvlJc w:val="left"/>
+      <w:pPr>
+        <w:ind w:left="6120" w:hanging="1440"/>
       </w:pPr>
       <w:rPr>
         <w:rFonts w:hint="default"/>
@@ -12333,14 +12625,14 @@
         <w:sz w:val="26"/>
       </w:rPr>
     </w:lvl>
-    <w:lvl w:ilvl="6">
+    <w:lvl w:ilvl="7">
       <w:start w:val="1"/>
       <w:numFmt w:val="decimal"/>
       <w:isLgl/>
-      <w:lvlText w:val="%1.%2.%3.%4.%5.%6.%7"/>
-      <w:lvlJc w:val="left"/>
-      <w:pPr>
-        <w:ind w:left="6120" w:hanging="1440"/>
+      <w:lvlText w:val="%1.%2.%3.%4.%5.%6.%7.%8"/>
+      <w:lvlJc w:val="left"/>
+      <w:pPr>
+        <w:ind w:left="6840" w:hanging="1440"/>
       </w:pPr>
       <w:rPr>
         <w:rFonts w:hint="default"/>
@@ -12348,14 +12640,14 @@
         <w:sz w:val="26"/>
       </w:rPr>
     </w:lvl>
-    <w:lvl w:ilvl="7">
+    <w:lvl w:ilvl="8">
       <w:start w:val="1"/>
       <w:numFmt w:val="decimal"/>
       <w:isLgl/>
-      <w:lvlText w:val="%1.%2.%3.%4.%5.%6.%7.%8"/>
-      <w:lvlJc w:val="left"/>
-      <w:pPr>
-        <w:ind w:left="6840" w:hanging="1440"/>
+      <w:lvlText w:val="%1.%2.%3.%4.%5.%6.%7.%8.%9"/>
+      <w:lvlJc w:val="left"/>
+      <w:pPr>
+        <w:ind w:left="7920" w:hanging="1800"/>
       </w:pPr>
       <w:rPr>
         <w:rFonts w:hint="default"/>
@@ -12363,23 +12655,8 @@
         <w:sz w:val="26"/>
       </w:rPr>
     </w:lvl>
-    <w:lvl w:ilvl="8">
-      <w:start w:val="1"/>
-      <w:numFmt w:val="decimal"/>
-      <w:isLgl/>
-      <w:lvlText w:val="%1.%2.%3.%4.%5.%6.%7.%8.%9"/>
-      <w:lvlJc w:val="left"/>
-      <w:pPr>
-        <w:ind w:left="7920" w:hanging="1800"/>
-      </w:pPr>
-      <w:rPr>
-        <w:rFonts w:hint="default"/>
-        <w:color w:val="B3186D" w:themeColor="accent1" w:themeShade="BF"/>
-        <w:sz w:val="26"/>
-      </w:rPr>
-    </w:lvl>
   </w:abstractNum>
-  <w:abstractNum w:abstractNumId="43" w15:restartNumberingAfterBreak="0">
+  <w:abstractNum w:abstractNumId="44" w15:restartNumberingAfterBreak="0">
     <w:nsid w:val="7F7E6B26"/>
     <w:multiLevelType w:val="hybridMultilevel"/>
     <w:tmpl w:val="BC86FF24"/>
@@ -12473,25 +12750,25 @@
     <w:abstractNumId w:val="8"/>
   </w:num>
   <w:num w:numId="2" w16cid:durableId="1435512104">
-    <w:abstractNumId w:val="42"/>
+    <w:abstractNumId w:val="43"/>
   </w:num>
   <w:num w:numId="3" w16cid:durableId="1848860497">
-    <w:abstractNumId w:val="35"/>
+    <w:abstractNumId w:val="36"/>
   </w:num>
   <w:num w:numId="4" w16cid:durableId="203060006">
-    <w:abstractNumId w:val="25"/>
+    <w:abstractNumId w:val="26"/>
   </w:num>
   <w:num w:numId="5" w16cid:durableId="449935456">
-    <w:abstractNumId w:val="29"/>
+    <w:abstractNumId w:val="30"/>
   </w:num>
   <w:num w:numId="6" w16cid:durableId="1493909927">
-    <w:abstractNumId w:val="39"/>
+    <w:abstractNumId w:val="40"/>
   </w:num>
   <w:num w:numId="7" w16cid:durableId="139079592">
-    <w:abstractNumId w:val="37"/>
+    <w:abstractNumId w:val="38"/>
   </w:num>
   <w:num w:numId="8" w16cid:durableId="1467775644">
-    <w:abstractNumId w:val="17"/>
+    <w:abstractNumId w:val="18"/>
   </w:num>
   <w:num w:numId="9" w16cid:durableId="1789425418">
     <w:abstractNumId w:val="2"/>
@@ -12503,31 +12780,31 @@
     <w:abstractNumId w:val="9"/>
   </w:num>
   <w:num w:numId="12" w16cid:durableId="1034499952">
-    <w:abstractNumId w:val="38"/>
+    <w:abstractNumId w:val="39"/>
   </w:num>
   <w:num w:numId="13" w16cid:durableId="800073175">
-    <w:abstractNumId w:val="34"/>
+    <w:abstractNumId w:val="35"/>
   </w:num>
   <w:num w:numId="14" w16cid:durableId="87697557">
     <w:abstractNumId w:val="1"/>
   </w:num>
   <w:num w:numId="15" w16cid:durableId="72047217">
-    <w:abstractNumId w:val="36"/>
+    <w:abstractNumId w:val="37"/>
   </w:num>
   <w:num w:numId="16" w16cid:durableId="636422382">
     <w:abstractNumId w:val="7"/>
   </w:num>
   <w:num w:numId="17" w16cid:durableId="91559878">
-    <w:abstractNumId w:val="28"/>
+    <w:abstractNumId w:val="29"/>
   </w:num>
   <w:num w:numId="18" w16cid:durableId="574360654">
-    <w:abstractNumId w:val="23"/>
+    <w:abstractNumId w:val="24"/>
   </w:num>
   <w:num w:numId="19" w16cid:durableId="271017689">
-    <w:abstractNumId w:val="30"/>
+    <w:abstractNumId w:val="31"/>
   </w:num>
   <w:num w:numId="20" w16cid:durableId="1958757724">
-    <w:abstractNumId w:val="41"/>
+    <w:abstractNumId w:val="42"/>
   </w:num>
   <w:num w:numId="21" w16cid:durableId="1713310693">
     <w:abstractNumId w:val="10"/>
@@ -12536,37 +12813,37 @@
     <w:abstractNumId w:val="13"/>
   </w:num>
   <w:num w:numId="23" w16cid:durableId="1434745602">
-    <w:abstractNumId w:val="40"/>
+    <w:abstractNumId w:val="41"/>
   </w:num>
   <w:num w:numId="24" w16cid:durableId="1450272972">
-    <w:abstractNumId w:val="31"/>
+    <w:abstractNumId w:val="32"/>
   </w:num>
   <w:num w:numId="25" w16cid:durableId="1026252662">
     <w:abstractNumId w:val="5"/>
   </w:num>
   <w:num w:numId="26" w16cid:durableId="1658991784">
-    <w:abstractNumId w:val="22"/>
+    <w:abstractNumId w:val="23"/>
   </w:num>
   <w:num w:numId="27" w16cid:durableId="731972392">
-    <w:abstractNumId w:val="18"/>
+    <w:abstractNumId w:val="19"/>
   </w:num>
   <w:num w:numId="28" w16cid:durableId="1581132572">
     <w:abstractNumId w:val="6"/>
   </w:num>
   <w:num w:numId="29" w16cid:durableId="1646927338">
-    <w:abstractNumId w:val="33"/>
+    <w:abstractNumId w:val="34"/>
   </w:num>
   <w:num w:numId="30" w16cid:durableId="1858812919">
-    <w:abstractNumId w:val="19"/>
+    <w:abstractNumId w:val="20"/>
   </w:num>
   <w:num w:numId="31" w16cid:durableId="1054815535">
-    <w:abstractNumId w:val="43"/>
+    <w:abstractNumId w:val="44"/>
   </w:num>
   <w:num w:numId="32" w16cid:durableId="1065881106">
-    <w:abstractNumId w:val="26"/>
+    <w:abstractNumId w:val="27"/>
   </w:num>
   <w:num w:numId="33" w16cid:durableId="1237668691">
-    <w:abstractNumId w:val="27"/>
+    <w:abstractNumId w:val="28"/>
   </w:num>
   <w:num w:numId="34" w16cid:durableId="1327055717">
     <w:abstractNumId w:val="14"/>
@@ -12575,7 +12852,7 @@
     <w:abstractNumId w:val="4"/>
   </w:num>
   <w:num w:numId="36" w16cid:durableId="924537586">
-    <w:abstractNumId w:val="16"/>
+    <w:abstractNumId w:val="17"/>
   </w:num>
   <w:num w:numId="37" w16cid:durableId="624165551">
     <w:abstractNumId w:val="15"/>
@@ -12590,16 +12867,19 @@
     <w:abstractNumId w:val="0"/>
   </w:num>
   <w:num w:numId="41" w16cid:durableId="251008069">
+    <w:abstractNumId w:val="22"/>
+  </w:num>
+  <w:num w:numId="42" w16cid:durableId="1813015476">
+    <w:abstractNumId w:val="33"/>
+  </w:num>
+  <w:num w:numId="43" w16cid:durableId="1934820186">
+    <w:abstractNumId w:val="25"/>
+  </w:num>
+  <w:num w:numId="44" w16cid:durableId="1838572191">
     <w:abstractNumId w:val="21"/>
   </w:num>
-  <w:num w:numId="42" w16cid:durableId="1813015476">
-    <w:abstractNumId w:val="32"/>
-  </w:num>
-  <w:num w:numId="43" w16cid:durableId="1934820186">
-    <w:abstractNumId w:val="24"/>
-  </w:num>
-  <w:num w:numId="44" w16cid:durableId="1838572191">
-    <w:abstractNumId w:val="20"/>
+  <w:num w:numId="45" w16cid:durableId="1064764890">
+    <w:abstractNumId w:val="16"/>
   </w:num>
   <w:numIdMacAtCleanup w:val="12"/>
 </w:numbering>
@@ -14063,6 +14343,112 @@
     <b:URL>https://www.geeksforgeeks.org/machine-learning/what-is-scikit-learn-random-state-in-splitting-dataset/</b:URL>
     <b:RefOrder>8</b:RefOrder>
   </b:Source>
+  <b:Source>
+    <b:Tag>MdA13</b:Tag>
+    <b:SourceType>InternetSite</b:SourceType>
+    <b:Guid>{881D1FFD-44F9-4E3A-BE6C-B699ECCB674A}</b:Guid>
+    <b:Title>Support Vector Machine and Random Forest Modeling for</b:Title>
+    <b:Year>2013</b:Year>
+    <b:YearAccessed>2026</b:YearAccessed>
+    <b:MonthAccessed>05</b:MonthAccessed>
+    <b:DayAccessed>09</b:DayAccessed>
+    <b:URL>https://link.ms4sub.com/id/eprint/322/1/JILSA_2014021411471330.pdf</b:URL>
+    <b:Author>
+      <b:Author>
+        <b:NameList>
+          <b:Person>
+            <b:Last>Hasan</b:Last>
+            <b:First>Md.</b:First>
+            <b:Middle>Al Mehedi</b:Middle>
+          </b:Person>
+          <b:Person>
+            <b:Last>Nasser</b:Last>
+            <b:First>Mohammed</b:First>
+          </b:Person>
+          <b:Person>
+            <b:Last>Pal</b:Last>
+            <b:First>Biprodip</b:First>
+          </b:Person>
+          <b:Person>
+            <b:Last>Ahmad</b:Last>
+            <b:First>Shamim</b:First>
+          </b:Person>
+        </b:NameList>
+      </b:Author>
+    </b:Author>
+    <b:RefOrder>12</b:RefOrder>
+  </b:Source>
+  <b:Source>
+    <b:Tag>SAN24</b:Tag>
+    <b:SourceType>InternetSite</b:SourceType>
+    <b:Guid>{DBD1ED33-9119-4185-B1DC-5AABAA99B8B3}</b:Guid>
+    <b:Title>Improvement of Random Forest Ensembling Algorithm Efficiency Through Cardinal Tuning of n_estimators Parameter.</b:Title>
+    <b:Year>2024</b:Year>
+    <b:YearAccessed>2026</b:YearAccessed>
+    <b:MonthAccessed>May</b:MonthAccessed>
+    <b:DayAccessed>11</b:DayAccessed>
+    <b:URL>https://openurl.ebsco.com/EPDB%3Agcd%3A15%3A27554287/detailv2?sid=ebsco%3Aplink%3Ascholar&amp;id=ebsco%3Agcd%3A175399141&amp;crl=c&amp;link_origin=scholar.google.com</b:URL>
+    <b:Author>
+      <b:Author>
+        <b:NameList>
+          <b:Person>
+            <b:Last>SANDHU</b:Last>
+            <b:First>GAURAV</b:First>
+          </b:Person>
+          <b:Person>
+            <b:Last>SINGH</b:Last>
+            <b:First>AMANDEEP</b:First>
+          </b:Person>
+          <b:Person>
+            <b:Last>BEDI</b:Last>
+            <b:First>PARMIDERPAL</b:First>
+            <b:Middle>SINGH</b:Middle>
+          </b:Person>
+          <b:Person>
+            <b:Last>LAMBA</b:Last>
+            <b:First>PUNEET</b:First>
+            <b:Middle>SINGH</b:Middle>
+          </b:Person>
+          <b:Person>
+            <b:Last>CHAUDHARY</b:Last>
+            <b:First>GOPAL</b:First>
+          </b:Person>
+        </b:NameList>
+      </b:Author>
+    </b:Author>
+    <b:RefOrder>13</b:RefOrder>
+  </b:Source>
+  <b:Source>
+    <b:Tag>Tah24</b:Tag>
+    <b:SourceType>InternetSite</b:SourceType>
+    <b:Guid>{CAEFFDA9-3803-4FD0-B08C-2931D8EF9E07}</b:Guid>
+    <b:Author>
+      <b:Author>
+        <b:NameList>
+          <b:Person>
+            <b:Last>Fulazzaky</b:Last>
+            <b:First>Tahira</b:First>
+          </b:Person>
+          <b:Person>
+            <b:Last>Saefuddin</b:Last>
+            <b:First>Asep</b:First>
+          </b:Person>
+          <b:Person>
+            <b:Last>Soleh</b:Last>
+            <b:First>Agus</b:First>
+            <b:Middle>Mohamad</b:Middle>
+          </b:Person>
+        </b:NameList>
+      </b:Author>
+    </b:Author>
+    <b:Title>Evaluating Ensemble Learning Techniques for Class Imbalance in Machine Learning: A Comparative Analysis of Balanced Random Forest, SMOTE-RF, SMOTEBoost, and RUSBoost</b:Title>
+    <b:Year>2024</b:Year>
+    <b:YearAccessed>2026</b:YearAccessed>
+    <b:MonthAccessed>May</b:MonthAccessed>
+    <b:DayAccessed>11</b:DayAccessed>
+    <b:URL>https://journal.unnes.ac.id/journals/sji/article/view/15937/2440</b:URL>
+    <b:RefOrder>14</b:RefOrder>
+  </b:Source>
 </b:Sources>
 </file>
 
@@ -14075,7 +14461,7 @@
 </file>
 
 <file path=customXml/itemProps2.xml><?xml version="1.0" encoding="utf-8"?>
-<ds:datastoreItem xmlns:ds="http://schemas.openxmlformats.org/officeDocument/2006/customXml" ds:itemID="{D3242A00-0F96-4A08-8D6D-5A4BA217C2BB}">
+<ds:datastoreItem xmlns:ds="http://schemas.openxmlformats.org/officeDocument/2006/customXml" ds:itemID="{62FA53F9-8651-49A2-8E13-470DFD32196D}">
   <ds:schemaRefs>
     <ds:schemaRef ds:uri="http://schemas.openxmlformats.org/officeDocument/2006/bibliography"/>
   </ds:schemaRefs>

</xml_diff>